<commit_message>
Rebrand both Yangmei grade 11 traffic safety courses and teaching kits
</commit_message>
<xml_diff>
--- a/teacher-led/materials/student-sheet.docx
+++ b/teacher-led/materials/student-sheet.docx
@@ -7,7 +7,14 @@
         <w:pStyle w:val="Title"/>
       </w:pPr>
       <w:r>
-        <w:t>放學路上的安全選擇</w:t>
+        <w:t>楊光梅好、安全第一</w:t>
+      </w:r>
+    </w:p>
+    <w:p>
+      <w:r>
+        <w:t>桃園市立楊梅高級中等學校｜高二交通安全充實課程</w:t>
+        <w:br/>
+        <w:t>看懂路口風險／做出安全通學選擇</w:t>
       </w:r>
     </w:p>
     <w:p>

</xml_diff>